<commit_message>
Finaliza os 5 ebooks com conteudo real e especifico
</commit_message>
<xml_diff>
--- a/docs/ebooks/01_Minimax_A_IA_Revolucionaria.docx
+++ b/docs/ebooks/01_Minimax_A_IA_Revolucionaria.docx
@@ -2,17 +2,84 @@
 <file path=word/document.xml><?xml version="1.0" encoding="utf-8"?>
 <w:document xmlns:wpc="http://schemas.microsoft.com/office/word/2010/wordprocessingCanvas" xmlns:mo="http://schemas.microsoft.com/office/mac/office/2008/main" xmlns:mc="http://schemas.openxmlformats.org/markup-compatibility/2006" xmlns:mv="urn:schemas-microsoft-com:mac:vml" xmlns:o="urn:schemas-microsoft-com:office:office" xmlns:r="http://schemas.openxmlformats.org/officeDocument/2006/relationships" xmlns:m="http://schemas.openxmlformats.org/officeDocument/2006/math" xmlns:v="urn:schemas-microsoft-com:vml" xmlns:wp14="http://schemas.microsoft.com/office/word/2010/wordprocessingDrawing" xmlns:wp="http://schemas.openxmlformats.org/drawingml/2006/wordprocessingDrawing" xmlns:w10="urn:schemas-microsoft-com:office:word" xmlns:w="http://schemas.openxmlformats.org/wordprocessingml/2006/main" xmlns:w14="http://schemas.microsoft.com/office/word/2010/wordml" xmlns:wpg="http://schemas.microsoft.com/office/word/2010/wordprocessingGroup" xmlns:wpi="http://schemas.microsoft.com/office/word/2010/wordprocessingInk" xmlns:wne="http://schemas.microsoft.com/office/word/2006/wordml" xmlns:wps="http://schemas.microsoft.com/office/word/2010/wordprocessingShape" mc:Ignorable="w14 wp14">
   <w:body>
+    <w:p/>
+    <w:p/>
+    <w:p/>
     <w:p>
       <w:pPr>
         <w:jc w:val="center"/>
       </w:pPr>
       <w:r>
         <w:rPr>
+          <w:rFonts w:ascii="Calibri" w:hAnsi="Calibri" w:cs="Calibri"/>
           <w:b/>
+          <w:i w:val="0"/>
           <w:color w:val="1F3864"/>
-          <w:sz w:val="56"/>
+          <w:sz w:val="72"/>
         </w:rPr>
         <w:t>Minimax - A IA Revolucionária</w:t>
+      </w:r>
+    </w:p>
+    <w:p>
+      <w:pPr>
+        <w:spacing w:before="240"/>
+        <w:jc w:val="center"/>
+      </w:pPr>
+      <w:r>
+        <w:rPr>
+          <w:rFonts w:ascii="Calibri" w:hAnsi="Calibri" w:cs="Calibri"/>
+          <w:b w:val="0"/>
+          <w:i/>
+          <w:color w:val="4472C4"/>
+          <w:sz w:val="36"/>
+        </w:rPr>
+        <w:t>Guia Completo para Dominar a Tecnologia que Está Transformando o Mundo</w:t>
+      </w:r>
+    </w:p>
+    <w:p/>
+    <w:p/>
+    <w:p>
+      <w:pPr>
+        <w:pBdr>
+          <w:bottom w:val="single" w:sz="8" w:space="1" w:color="4472C4"/>
+        </w:pBdr>
+      </w:pPr>
+    </w:p>
+    <w:p>
+      <w:pPr>
+        <w:spacing w:before="360"/>
+        <w:jc w:val="center"/>
+      </w:pPr>
+      <w:r>
+        <w:rPr>
+          <w:rFonts w:ascii="Calibri" w:hAnsi="Calibri" w:cs="Calibri"/>
+          <w:b w:val="0"/>
+          <w:i/>
+          <w:color w:val="707070"/>
+          <w:sz w:val="26"/>
+        </w:rPr>
+        <w:t>Descubra como a Minimax está redefinindo o que é possível com inteligência artificial generativa.</w:t>
+      </w:r>
+    </w:p>
+    <w:p/>
+    <w:p/>
+    <w:p/>
+    <w:p/>
+    <w:p/>
+    <w:p/>
+    <w:p>
+      <w:pPr>
+        <w:jc w:val="center"/>
+      </w:pPr>
+      <w:r>
+        <w:rPr>
+          <w:rFonts w:ascii="Calibri" w:hAnsi="Calibri" w:cs="Calibri"/>
+          <w:b/>
+          <w:i w:val="0"/>
+          <w:color w:val="1F3864"/>
+          <w:sz w:val="28"/>
+        </w:rPr>
+        <w:t>Por MMN AI-to-AI</w:t>
       </w:r>
     </w:p>
     <w:p>
@@ -21,22 +88,13 @@
       </w:pPr>
       <w:r>
         <w:rPr>
-          <w:color w:val="4472C4"/>
-          <w:sz w:val="28"/>
+          <w:rFonts w:ascii="Calibri" w:hAnsi="Calibri" w:cs="Calibri"/>
+          <w:b w:val="0"/>
+          <w:i w:val="0"/>
+          <w:color w:val="707070"/>
+          <w:sz w:val="22"/>
         </w:rPr>
-        <w:t>Guia Completo para Dominar a Tecnologia que Está Transformando o Mundo</w:t>
-      </w:r>
-    </w:p>
-    <w:p>
-      <w:pPr>
-        <w:jc w:val="center"/>
-      </w:pPr>
-      <w:r>
-        <w:rPr>
-          <w:i/>
-          <w:sz w:val="24"/>
-        </w:rPr>
-        <w:t>Por MMN AI-to-AI</w:t>
+        <w:t>MMN AI-to-AI • 2026</w:t>
       </w:r>
     </w:p>
     <w:p>
@@ -46,371 +104,1262 @@
     </w:p>
     <w:p>
       <w:pPr>
-        <w:pStyle w:val="Heading1"/>
+        <w:jc w:val="left"/>
       </w:pPr>
       <w:r>
         <w:rPr>
+          <w:rFonts w:ascii="Calibri" w:hAnsi="Calibri" w:cs="Calibri"/>
+          <w:b/>
+          <w:i w:val="0"/>
           <w:color w:val="1F3864"/>
-          <w:sz w:val="36"/>
+          <w:sz w:val="56"/>
         </w:rPr>
-        <w:t>Introdução</w:t>
+        <w:t>Sobre este ebook</w:t>
       </w:r>
     </w:p>
     <w:p>
       <w:pPr>
-        <w:spacing w:after="160"/>
+        <w:pBdr>
+          <w:bottom w:val="single" w:sz="8" w:space="1" w:color="4472C4"/>
+        </w:pBdr>
+      </w:pPr>
+    </w:p>
+    <w:p>
+      <w:pPr>
+        <w:spacing w:before="360" w:line="360" w:lineRule="auto" w:after="240"/>
       </w:pPr>
       <w:r>
         <w:rPr>
-          <w:sz w:val="22"/>
+          <w:rFonts w:ascii="Calibri" w:hAnsi="Calibri" w:cs="Calibri"/>
+          <w:b w:val="0"/>
+          <w:i w:val="0"/>
+          <w:color w:val="202020"/>
+          <w:sz w:val="24"/>
         </w:rPr>
-        <w:t>Bem-vindo a este guia completo sobre inteligência artificial.</w:t>
+        <w:t>Vivemos o momento mais disruptivo da história da tecnologia desde a invenção da internet. A Minimax surge como uma das inteligências artificiais mais avançadas do planeta, capaz de raciocinar, planejar, executar tarefas complexas em múltiplas etapas, escrever código, analisar documentos, gerar imagens, falar em qualquer idioma e até mesmo operar outras ferramentas digitais de forma autônoma. Este ebook foi criado para ser o seu mapa de entrada nesse universo. Ao longo de 10 capítulos objetivos, você vai entender o que torna a Minimax diferente, como usá-la no dia a dia, quais são as técnicas de prompt que separam amadores de profissionais, e como aplicar tudo isso para ganhar tempo, dinheiro e vantagem competitiva. Seja você um empreendedor, um profissional liberal, um estudante ou simplesmente alguém curioso sobre o futuro, este guia vai colocar você vários passos à frente da multidão.</w:t>
       </w:r>
     </w:p>
     <w:p>
       <w:pPr>
-        <w:spacing w:after="160"/>
+        <w:spacing w:before="480"/>
       </w:pPr>
       <w:r>
         <w:rPr>
-          <w:sz w:val="22"/>
+          <w:rFonts w:ascii="Calibri" w:hAnsi="Calibri" w:cs="Calibri"/>
+          <w:b/>
+          <w:i w:val="0"/>
+          <w:color w:val="1F3864"/>
+          <w:sz w:val="44"/>
         </w:rPr>
-        <w:t>Este ebook foi criado para ajudar você a dominar as ferramentas de IA mais modernas e obter resultados extraordinários.</w:t>
-      </w:r>
-    </w:p>
-    <w:p/>
-    <w:p>
-      <w:pPr>
-        <w:pStyle w:val="Heading1"/>
-      </w:pPr>
-      <w:r>
-        <w:rPr>
-          <w:color w:val="1F3864"/>
-          <w:sz w:val="36"/>
-        </w:rPr>
-        <w:t>Conceitos Fundamentais</w:t>
+        <w:t>Sumário</w:t>
       </w:r>
     </w:p>
     <w:p>
       <w:pPr>
-        <w:pStyle w:val="Heading2"/>
+        <w:pBdr>
+          <w:bottom w:val="single" w:sz="8" w:space="1" w:color="4472C4"/>
+        </w:pBdr>
+      </w:pPr>
+    </w:p>
+    <w:p>
+      <w:pPr>
+        <w:spacing w:before="160"/>
+        <w:ind w:left="283"/>
       </w:pPr>
       <w:r>
         <w:rPr>
+          <w:rFonts w:ascii="Calibri" w:hAnsi="Calibri" w:cs="Calibri"/>
+          <w:b/>
+          <w:i w:val="0"/>
           <w:color w:val="4472C4"/>
-          <w:sz w:val="28"/>
+          <w:sz w:val="24"/>
         </w:rPr>
-        <w:t>O que você precisa saber</w:t>
+        <w:t xml:space="preserve">• </w:t>
+      </w:r>
+      <w:r>
+        <w:rPr>
+          <w:rFonts w:ascii="Calibri" w:hAnsi="Calibri" w:cs="Calibri"/>
+          <w:b w:val="0"/>
+          <w:i w:val="0"/>
+          <w:color w:val="202020"/>
+          <w:sz w:val="24"/>
+        </w:rPr>
+        <w:t>1. O que é a Minimax e por que ela importa</w:t>
       </w:r>
     </w:p>
     <w:p>
       <w:pPr>
-        <w:spacing w:after="160"/>
+        <w:spacing w:before="160"/>
+        <w:ind w:left="283"/>
       </w:pPr>
       <w:r>
         <w:rPr>
-          <w:sz w:val="22"/>
+          <w:rFonts w:ascii="Calibri" w:hAnsi="Calibri" w:cs="Calibri"/>
+          <w:b/>
+          <w:i w:val="0"/>
+          <w:color w:val="4472C4"/>
+          <w:sz w:val="24"/>
         </w:rPr>
-        <w:t>Aqui você encontrará informações essenciais sobre o tema abordado, com explicações claras e práticas.</w:t>
+        <w:t xml:space="preserve">• </w:t>
       </w:r>
-    </w:p>
-    <w:p/>
-    <w:p>
-      <w:pPr>
-        <w:pStyle w:val="Heading1"/>
-      </w:pPr>
       <w:r>
         <w:rPr>
-          <w:color w:val="1F3864"/>
-          <w:sz w:val="36"/>
+          <w:rFonts w:ascii="Calibri" w:hAnsi="Calibri" w:cs="Calibri"/>
+          <w:b w:val="0"/>
+          <w:i w:val="0"/>
+          <w:color w:val="202020"/>
+          <w:sz w:val="24"/>
         </w:rPr>
-        <w:t>Aplicações Práticas</w:t>
+        <w:t>2. Conceitos Fundamentais: Como a Minimax Pensa</w:t>
       </w:r>
     </w:p>
     <w:p>
       <w:pPr>
-        <w:spacing w:after="160"/>
+        <w:spacing w:before="160"/>
+        <w:ind w:left="283"/>
       </w:pPr>
       <w:r>
         <w:rPr>
-          <w:sz w:val="22"/>
+          <w:rFonts w:ascii="Calibri" w:hAnsi="Calibri" w:cs="Calibri"/>
+          <w:b/>
+          <w:i w:val="0"/>
+          <w:color w:val="4472C4"/>
+          <w:sz w:val="24"/>
         </w:rPr>
-        <w:t>As aplicações práticas são vastas e podem transformar sua vida profissional e pessoal.</w:t>
+        <w:t xml:space="preserve">• </w:t>
+      </w:r>
+      <w:r>
+        <w:rPr>
+          <w:rFonts w:ascii="Calibri" w:hAnsi="Calibri" w:cs="Calibri"/>
+          <w:b w:val="0"/>
+          <w:i w:val="0"/>
+          <w:color w:val="202020"/>
+          <w:sz w:val="24"/>
+        </w:rPr>
+        <w:t>3. Aplicações Práticas no Dia a Dia</w:t>
       </w:r>
     </w:p>
     <w:p>
       <w:pPr>
-        <w:spacing w:after="160"/>
+        <w:spacing w:before="160"/>
+        <w:ind w:left="283"/>
       </w:pPr>
       <w:r>
         <w:rPr>
-          <w:sz w:val="22"/>
+          <w:rFonts w:ascii="Calibri" w:hAnsi="Calibri" w:cs="Calibri"/>
+          <w:b/>
+          <w:i w:val="0"/>
+          <w:color w:val="4472C4"/>
+          <w:sz w:val="24"/>
         </w:rPr>
-        <w:t>Explore exemplos reais de como implementar o conhecimento adquirido.</w:t>
+        <w:t xml:space="preserve">• </w:t>
       </w:r>
-    </w:p>
-    <w:p/>
-    <w:p>
-      <w:pPr>
-        <w:pStyle w:val="Heading1"/>
-      </w:pPr>
       <w:r>
         <w:rPr>
-          <w:color w:val="1F3864"/>
-          <w:sz w:val="36"/>
+          <w:rFonts w:ascii="Calibri" w:hAnsi="Calibri" w:cs="Calibri"/>
+          <w:b w:val="0"/>
+          <w:i w:val="0"/>
+          <w:color w:val="202020"/>
+          <w:sz w:val="24"/>
         </w:rPr>
-        <w:t>Estratégias Avançadas</w:t>
+        <w:t>4. Estratégias Avançadas de Prompt</w:t>
       </w:r>
     </w:p>
     <w:p>
       <w:pPr>
-        <w:pStyle w:val="Heading2"/>
+        <w:spacing w:before="160"/>
+        <w:ind w:left="283"/>
       </w:pPr>
       <w:r>
         <w:rPr>
+          <w:rFonts w:ascii="Calibri" w:hAnsi="Calibri" w:cs="Calibri"/>
+          <w:b/>
+          <w:i w:val="0"/>
           <w:color w:val="4472C4"/>
-          <w:sz w:val="28"/>
+          <w:sz w:val="24"/>
         </w:rPr>
-        <w:t>Dominando o Avançado</w:t>
+        <w:t xml:space="preserve">• </w:t>
+      </w:r>
+      <w:r>
+        <w:rPr>
+          <w:rFonts w:ascii="Calibri" w:hAnsi="Calibri" w:cs="Calibri"/>
+          <w:b w:val="0"/>
+          <w:i w:val="0"/>
+          <w:color w:val="202020"/>
+          <w:sz w:val="24"/>
+        </w:rPr>
+        <w:t>5. Melhores Práticas e Hábito dos Top Usuários</w:t>
       </w:r>
     </w:p>
     <w:p>
       <w:pPr>
-        <w:spacing w:after="160"/>
+        <w:spacing w:before="160"/>
+        <w:ind w:left="283"/>
       </w:pPr>
       <w:r>
         <w:rPr>
-          <w:sz w:val="22"/>
+          <w:rFonts w:ascii="Calibri" w:hAnsi="Calibri" w:cs="Calibri"/>
+          <w:b/>
+          <w:i w:val="0"/>
+          <w:color w:val="4472C4"/>
+          <w:sz w:val="24"/>
         </w:rPr>
-        <w:t>Técnicas avançadas para quem quer ir além do básico e dominar completamente o assunto.</w:t>
+        <w:t xml:space="preserve">• </w:t>
       </w:r>
-    </w:p>
-    <w:p/>
-    <w:p>
-      <w:pPr>
-        <w:pStyle w:val="Heading1"/>
-      </w:pPr>
       <w:r>
         <w:rPr>
-          <w:color w:val="1F3864"/>
-          <w:sz w:val="36"/>
+          <w:rFonts w:ascii="Calibri" w:hAnsi="Calibri" w:cs="Calibri"/>
+          <w:b w:val="0"/>
+          <w:i w:val="0"/>
+          <w:color w:val="202020"/>
+          <w:sz w:val="24"/>
         </w:rPr>
-        <w:t>Melhores Práticas</w:t>
+        <w:t>6. Estudos de Caso: Resultados Reais</w:t>
       </w:r>
     </w:p>
     <w:p>
       <w:pPr>
-        <w:spacing w:after="160"/>
+        <w:spacing w:before="160"/>
+        <w:ind w:left="283"/>
       </w:pPr>
       <w:r>
         <w:rPr>
-          <w:sz w:val="22"/>
+          <w:rFonts w:ascii="Calibri" w:hAnsi="Calibri" w:cs="Calibri"/>
+          <w:b/>
+          <w:i w:val="0"/>
+          <w:color w:val="4472C4"/>
+          <w:sz w:val="24"/>
         </w:rPr>
-        <w:t>Aprenda com os melhores através de dicas práticas e estratégias comprovadas.</w:t>
+        <w:t xml:space="preserve">• </w:t>
+      </w:r>
+      <w:r>
+        <w:rPr>
+          <w:rFonts w:ascii="Calibri" w:hAnsi="Calibri" w:cs="Calibri"/>
+          <w:b w:val="0"/>
+          <w:i w:val="0"/>
+          <w:color w:val="202020"/>
+          <w:sz w:val="24"/>
+        </w:rPr>
+        <w:t>7. Ferramentas e Recursos Complementares</w:t>
       </w:r>
     </w:p>
     <w:p>
       <w:pPr>
-        <w:spacing w:after="160"/>
+        <w:spacing w:before="160"/>
+        <w:ind w:left="283"/>
       </w:pPr>
       <w:r>
         <w:rPr>
-          <w:sz w:val="22"/>
+          <w:rFonts w:ascii="Calibri" w:hAnsi="Calibri" w:cs="Calibri"/>
+          <w:b/>
+          <w:i w:val="0"/>
+          <w:color w:val="4472C4"/>
+          <w:sz w:val="24"/>
         </w:rPr>
-        <w:t>Evite erros comuns e maximize seus resultados.</w:t>
+        <w:t xml:space="preserve">• </w:t>
       </w:r>
-    </w:p>
-    <w:p/>
-    <w:p>
-      <w:pPr>
-        <w:pStyle w:val="Heading1"/>
-      </w:pPr>
       <w:r>
         <w:rPr>
-          <w:color w:val="1F3864"/>
-          <w:sz w:val="36"/>
+          <w:rFonts w:ascii="Calibri" w:hAnsi="Calibri" w:cs="Calibri"/>
+          <w:b w:val="0"/>
+          <w:i w:val="0"/>
+          <w:color w:val="202020"/>
+          <w:sz w:val="24"/>
         </w:rPr>
-        <w:t>Estudos de Caso</w:t>
+        <w:t>8. Passo a Passo: Seu Primeiro Projeto com Minimax</w:t>
       </w:r>
     </w:p>
     <w:p>
       <w:pPr>
-        <w:spacing w:after="160"/>
+        <w:spacing w:before="160"/>
+        <w:ind w:left="283"/>
       </w:pPr>
       <w:r>
         <w:rPr>
-          <w:sz w:val="22"/>
+          <w:rFonts w:ascii="Calibri" w:hAnsi="Calibri" w:cs="Calibri"/>
+          <w:b/>
+          <w:i w:val="0"/>
+          <w:color w:val="4472C4"/>
+          <w:sz w:val="24"/>
         </w:rPr>
-        <w:t>Analise casos reais de sucesso e entenda o que funcionou.</w:t>
+        <w:t xml:space="preserve">• </w:t>
+      </w:r>
+      <w:r>
+        <w:rPr>
+          <w:rFonts w:ascii="Calibri" w:hAnsi="Calibri" w:cs="Calibri"/>
+          <w:b w:val="0"/>
+          <w:i w:val="0"/>
+          <w:color w:val="202020"/>
+          <w:sz w:val="24"/>
+        </w:rPr>
+        <w:t>9. Erros Comuns que Você Deve Evitar</w:t>
       </w:r>
     </w:p>
     <w:p>
       <w:pPr>
-        <w:spacing w:after="160"/>
+        <w:spacing w:before="160"/>
+        <w:ind w:left="283"/>
       </w:pPr>
       <w:r>
         <w:rPr>
-          <w:sz w:val="22"/>
+          <w:rFonts w:ascii="Calibri" w:hAnsi="Calibri" w:cs="Calibri"/>
+          <w:b/>
+          <w:i w:val="0"/>
+          <w:color w:val="4472C4"/>
+          <w:sz w:val="24"/>
         </w:rPr>
-        <w:t>Aplique as lições aprendidas ao seu contexto.</w:t>
+        <w:t xml:space="preserve">• </w:t>
+      </w:r>
+      <w:r>
+        <w:rPr>
+          <w:rFonts w:ascii="Calibri" w:hAnsi="Calibri" w:cs="Calibri"/>
+          <w:b w:val="0"/>
+          <w:i w:val="0"/>
+          <w:color w:val="202020"/>
+          <w:sz w:val="24"/>
+        </w:rPr>
+        <w:t>10. Conclusão: O Futuro é Híbrido</w:t>
       </w:r>
     </w:p>
-    <w:p/>
     <w:p>
-      <w:pPr>
-        <w:pStyle w:val="Heading1"/>
-      </w:pPr>
       <w:r>
-        <w:rPr>
-          <w:color w:val="1F3864"/>
-          <w:sz w:val="36"/>
-        </w:rPr>
-        <w:t>Ferramentas e Recursos</w:t>
+        <w:br w:type="page"/>
       </w:r>
     </w:p>
     <w:p>
       <w:pPr>
-        <w:spacing w:after="160"/>
+        <w:jc w:val="left"/>
       </w:pPr>
       <w:r>
         <w:rPr>
-          <w:sz w:val="22"/>
+          <w:rFonts w:ascii="Calibri" w:hAnsi="Calibri" w:cs="Calibri"/>
+          <w:b/>
+          <w:i w:val="0"/>
+          <w:color w:val="1F3864"/>
+          <w:sz w:val="48"/>
         </w:rPr>
-        <w:t>Conheça as principais ferramentas disponíveis no mercado.</w:t>
+        <w:t>1. O que é a Minimax e por que ela importa</w:t>
       </w:r>
     </w:p>
     <w:p>
       <w:pPr>
-        <w:spacing w:after="160"/>
+        <w:pBdr>
+          <w:bottom w:val="single" w:sz="8" w:space="1" w:color="4472C4"/>
+        </w:pBdr>
+      </w:pPr>
+    </w:p>
+    <w:p>
+      <w:pPr>
+        <w:spacing w:before="400" w:after="160"/>
       </w:pPr>
       <w:r>
         <w:rPr>
-          <w:sz w:val="22"/>
+          <w:rFonts w:ascii="Calibri" w:hAnsi="Calibri" w:cs="Calibri"/>
+          <w:b/>
+          <w:i w:val="0"/>
+          <w:color w:val="4472C4"/>
+          <w:sz w:val="32"/>
         </w:rPr>
-        <w:t>Recursos adicionais para aprofundar seu conhecimento.</w:t>
-      </w:r>
-    </w:p>
-    <w:p/>
-    <w:p>
-      <w:pPr>
-        <w:pStyle w:val="Heading1"/>
-      </w:pPr>
-      <w:r>
-        <w:rPr>
-          <w:color w:val="1F3864"/>
-          <w:sz w:val="36"/>
-        </w:rPr>
-        <w:t>Passo a Passo</w:t>
+        <w:t>A nova geração de modelos de IA</w:t>
       </w:r>
     </w:p>
     <w:p>
       <w:pPr>
-        <w:pStyle w:val="Heading2"/>
+        <w:spacing w:line="360" w:lineRule="auto" w:after="200"/>
+        <w:ind w:firstLine="0"/>
       </w:pPr>
       <w:r>
         <w:rPr>
-          <w:color w:val="4472C4"/>
-          <w:sz w:val="28"/>
+          <w:rFonts w:ascii="Calibri" w:hAnsi="Calibri" w:cs="Calibri"/>
+          <w:b w:val="0"/>
+          <w:i w:val="0"/>
+          <w:color w:val="202020"/>
+          <w:sz w:val="24"/>
         </w:rPr>
-        <w:t>Implementação</w:t>
+        <w:t>A Minimax não é apenas mais um chatbot. Ela é um modelo de linguagem de grande escala (LLM) treinado com técnicas de ponta como Mistura de Especialistas (MoE), aprendizado por reforço com feedback humano (RLHF) e ajuste fino por instrução. O resultado é um sistema que entende contexto com profundidade, lembra conversas longas, raciocina passo a passo e produz respostas estruturadas em texto, código, tabelas, JSON e marcação. Diferente dos modelos antigos que 'completavam frases', a Minimax foi projetada para seguir instruções complexas, manter coerência em documentos extensos e colaborar com o usuário em tarefas que exigem múltiplas etapas.</w:t>
       </w:r>
     </w:p>
     <w:p>
       <w:pPr>
-        <w:spacing w:after="160"/>
+        <w:spacing w:before="400" w:after="160"/>
       </w:pPr>
       <w:r>
         <w:rPr>
-          <w:sz w:val="22"/>
+          <w:rFonts w:ascii="Calibri" w:hAnsi="Calibri" w:cs="Calibri"/>
+          <w:b/>
+          <w:i w:val="0"/>
+          <w:color w:val="4472C4"/>
+          <w:sz w:val="32"/>
         </w:rPr>
-        <w:t>Siga estes passos para implementar o que aprendeu.</w:t>
+        <w:t>Por que isso muda tudo</w:t>
       </w:r>
     </w:p>
     <w:p>
       <w:pPr>
-        <w:spacing w:after="160"/>
+        <w:spacing w:line="360" w:lineRule="auto" w:after="200"/>
+        <w:ind w:firstLine="0"/>
       </w:pPr>
       <w:r>
         <w:rPr>
-          <w:sz w:val="22"/>
+          <w:rFonts w:ascii="Calibri" w:hAnsi="Calibri" w:cs="Calibri"/>
+          <w:b w:val="0"/>
+          <w:i w:val="0"/>
+          <w:color w:val="202020"/>
+          <w:sz w:val="24"/>
         </w:rPr>
-        <w:t>Cada etapa foi projetada para garantir resultados.</w:t>
+        <w:t>Pela primeira vez na história, qualquer pessoa com acesso à internet tem à disposição um assistente capaz de trabalhar 24 horas por dia, 7 dias por semana, em dezenas de idiomas, sem perder a qualidade. Isso democratiza habilidades que antes exigiam anos de estudo: programação, redação publicitária, análise de dados, tradução, design de prompts, planejamento estratégico e muito mais. Empresas inteiras estão sendo reconstruídas em torno dessa nova camada de inteligência. Profissionais que aprendem a usar a Minimax de forma avançada estão multiplicando sua produtividade e conquistando posições antes inacessíveis.</w:t>
       </w:r>
     </w:p>
-    <w:p/>
     <w:p>
-      <w:pPr>
-        <w:pStyle w:val="Heading1"/>
-      </w:pPr>
       <w:r>
-        <w:rPr>
-          <w:color w:val="1F3864"/>
-          <w:sz w:val="36"/>
-        </w:rPr>
-        <w:t>Erros Comuns</w:t>
+        <w:br w:type="page"/>
       </w:r>
     </w:p>
     <w:p>
       <w:pPr>
-        <w:spacing w:after="160"/>
+        <w:jc w:val="left"/>
       </w:pPr>
       <w:r>
         <w:rPr>
-          <w:sz w:val="22"/>
+          <w:rFonts w:ascii="Calibri" w:hAnsi="Calibri" w:cs="Calibri"/>
+          <w:b/>
+          <w:i w:val="0"/>
+          <w:color w:val="1F3864"/>
+          <w:sz w:val="48"/>
         </w:rPr>
-        <w:t>Identifique e evite os erros mais comuns.</w:t>
+        <w:t>2. Conceitos Fundamentais: Como a Minimax Pensa</w:t>
       </w:r>
     </w:p>
     <w:p>
       <w:pPr>
-        <w:spacing w:after="160"/>
+        <w:pBdr>
+          <w:bottom w:val="single" w:sz="8" w:space="1" w:color="4472C4"/>
+        </w:pBdr>
+      </w:pPr>
+    </w:p>
+    <w:p>
+      <w:pPr>
+        <w:spacing w:before="400" w:after="160"/>
       </w:pPr>
       <w:r>
         <w:rPr>
-          <w:sz w:val="22"/>
+          <w:rFonts w:ascii="Calibri" w:hAnsi="Calibri" w:cs="Calibri"/>
+          <w:b/>
+          <w:i w:val="0"/>
+          <w:color w:val="4472C4"/>
+          <w:sz w:val="32"/>
         </w:rPr>
-        <w:t>Economize tempo e recursos evitando armadilhas.</w:t>
-      </w:r>
-    </w:p>
-    <w:p/>
-    <w:p>
-      <w:pPr>
-        <w:pStyle w:val="Heading1"/>
-      </w:pPr>
-      <w:r>
-        <w:rPr>
-          <w:color w:val="1F3864"/>
-          <w:sz w:val="36"/>
-        </w:rPr>
-        <w:t>Conclusão</w:t>
+        <w:t>Tokens, contexto e janela de atenção</w:t>
       </w:r>
     </w:p>
     <w:p>
       <w:pPr>
-        <w:spacing w:after="160"/>
+        <w:spacing w:line="360" w:lineRule="auto" w:after="200"/>
+        <w:ind w:firstLine="0"/>
       </w:pPr>
       <w:r>
         <w:rPr>
-          <w:sz w:val="22"/>
+          <w:rFonts w:ascii="Calibri" w:hAnsi="Calibri" w:cs="Calibri"/>
+          <w:b w:val="0"/>
+          <w:i w:val="0"/>
+          <w:color w:val="202020"/>
+          <w:sz w:val="24"/>
         </w:rPr>
-        <w:t>Parabéns por completar este guia!</w:t>
+        <w:t>Tudo o que a Minimax lê ou escreve é dividido em 'tokens' — pequenas unidades de texto que podem ser palavras, sílabas ou pedaços de palavras. O modelo tem uma 'janela de contexto' que define quanto conteúdo ele consegue processar de uma única vez. Modelos mais novos suportam centenas de milhares de tokens, o que equivale a livros inteiros. Quanto melhor você entender o conceito de contexto, mais estratégico será o uso: você pode colar um PDF inteiro, pedir um resumo, depois fazer perguntas específicas, e o modelo vai lembrar de tudo.</w:t>
       </w:r>
     </w:p>
     <w:p>
       <w:pPr>
-        <w:spacing w:after="160"/>
+        <w:spacing w:before="400" w:after="160"/>
       </w:pPr>
       <w:r>
         <w:rPr>
-          <w:sz w:val="22"/>
+          <w:rFonts w:ascii="Calibri" w:hAnsi="Calibri" w:cs="Calibri"/>
+          <w:b/>
+          <w:i w:val="0"/>
+          <w:color w:val="4472C4"/>
+          <w:sz w:val="32"/>
         </w:rPr>
-        <w:t>Agora você tem todas as ferramentas para ter sucesso. Continue aprendendo e evoluindo.</w:t>
+        <w:t>Raciocínio, planejamento e cadeia de pensamento</w:t>
+      </w:r>
+    </w:p>
+    <w:p>
+      <w:pPr>
+        <w:spacing w:line="360" w:lineRule="auto" w:after="200"/>
+        <w:ind w:firstLine="0"/>
+      </w:pPr>
+      <w:r>
+        <w:rPr>
+          <w:rFonts w:ascii="Calibri" w:hAnsi="Calibri" w:cs="Calibri"/>
+          <w:b w:val="0"/>
+          <w:i w:val="0"/>
+          <w:color w:val="202020"/>
+          <w:sz w:val="24"/>
+        </w:rPr>
+        <w:t>Modelos modernos como a Minimax usam uma técnica chamada 'chain-of-thought' (cadeia de pensamento). Em vez de pular direto para a resposta final, o sistema pensa passo a passo, quebrando problemas complexos em etapas menores. Quando você pede 'explique seu raciocínio' ou 'pense em voz alta', você está ativando esse modo de raciocínio profundo, que produz respostas muito mais precisas em matemática, lógica, estratégia e programação.</w:t>
+      </w:r>
+    </w:p>
+    <w:p>
+      <w:pPr>
+        <w:spacing w:before="400" w:after="160"/>
+      </w:pPr>
+      <w:r>
+        <w:rPr>
+          <w:rFonts w:ascii="Calibri" w:hAnsi="Calibri" w:cs="Calibri"/>
+          <w:b/>
+          <w:i w:val="0"/>
+          <w:color w:val="4472C4"/>
+          <w:sz w:val="32"/>
+        </w:rPr>
+        <w:t>Alucinações e como mitigá-las</w:t>
+      </w:r>
+    </w:p>
+    <w:p>
+      <w:pPr>
+        <w:spacing w:line="360" w:lineRule="auto" w:after="200"/>
+        <w:ind w:firstLine="0"/>
+      </w:pPr>
+      <w:r>
+        <w:rPr>
+          <w:rFonts w:ascii="Calibri" w:hAnsi="Calibri" w:cs="Calibri"/>
+          <w:b w:val="0"/>
+          <w:i w:val="0"/>
+          <w:color w:val="202020"/>
+          <w:sz w:val="24"/>
+        </w:rPr>
+        <w:t>Alucinação é o nome dado ao fenômeno em que a IA inventa informações com aparente confiança. Isso acontece porque o modelo gera a resposta com base em padrões estatísticos, não em uma 'verdade' armazenada. A Minimax reduz alucinações através de busca na web, modo de raciocínio e ancoragem em documentos fornecidos. Do seu lado, você pode mitigá-las pedindo citações, dizendo 'se não souber, diga que não sabe' e sempre verificando informações críticas em fontes confiáveis.</w:t>
+      </w:r>
+    </w:p>
+    <w:p>
+      <w:r>
+        <w:br w:type="page"/>
+      </w:r>
+    </w:p>
+    <w:p>
+      <w:pPr>
+        <w:jc w:val="left"/>
+      </w:pPr>
+      <w:r>
+        <w:rPr>
+          <w:rFonts w:ascii="Calibri" w:hAnsi="Calibri" w:cs="Calibri"/>
+          <w:b/>
+          <w:i w:val="0"/>
+          <w:color w:val="1F3864"/>
+          <w:sz w:val="48"/>
+        </w:rPr>
+        <w:t>3. Aplicações Práticas no Dia a Dia</w:t>
+      </w:r>
+    </w:p>
+    <w:p>
+      <w:pPr>
+        <w:pBdr>
+          <w:bottom w:val="single" w:sz="8" w:space="1" w:color="4472C4"/>
+        </w:pBdr>
+      </w:pPr>
+    </w:p>
+    <w:p>
+      <w:pPr>
+        <w:spacing w:before="400" w:after="160"/>
+      </w:pPr>
+      <w:r>
+        <w:rPr>
+          <w:rFonts w:ascii="Calibri" w:hAnsi="Calibri" w:cs="Calibri"/>
+          <w:b/>
+          <w:i w:val="0"/>
+          <w:color w:val="4472C4"/>
+          <w:sz w:val="32"/>
+        </w:rPr>
+        <w:t>Produtividade pessoal e profissional</w:t>
+      </w:r>
+    </w:p>
+    <w:p>
+      <w:pPr>
+        <w:spacing w:line="360" w:lineRule="auto" w:after="200"/>
+        <w:ind w:firstLine="0"/>
+      </w:pPr>
+      <w:r>
+        <w:rPr>
+          <w:rFonts w:ascii="Calibri" w:hAnsi="Calibri" w:cs="Calibri"/>
+          <w:b w:val="0"/>
+          <w:i w:val="0"/>
+          <w:color w:val="202020"/>
+          <w:sz w:val="24"/>
+        </w:rPr>
+        <w:t>A Minimax é uma ferramenta poderosa para ganhar horas por semana. Exemplos práticos incluem: redigir e responder e-mails em segundos, resumir reuniões longas, criar planilhas e tabelas, organizar ideias em mapas mentais, traduzir documentos, revisar contratos e até mesmo preparar apresentações completas. O segredo é tratar a IA como um estagiário brilhante, mas que precisa de instruções claras. Quanto mais específico você for no pedido, melhor será a entrega.</w:t>
+      </w:r>
+    </w:p>
+    <w:p>
+      <w:pPr>
+        <w:spacing w:before="400" w:after="160"/>
+      </w:pPr>
+      <w:r>
+        <w:rPr>
+          <w:rFonts w:ascii="Calibri" w:hAnsi="Calibri" w:cs="Calibri"/>
+          <w:b/>
+          <w:i w:val="0"/>
+          <w:color w:val="4472C4"/>
+          <w:sz w:val="32"/>
+        </w:rPr>
+        <w:t>Estudo e aprendizado acelerado</w:t>
+      </w:r>
+    </w:p>
+    <w:p>
+      <w:pPr>
+        <w:spacing w:line="360" w:lineRule="auto" w:after="200"/>
+        <w:ind w:firstLine="0"/>
+      </w:pPr>
+      <w:r>
+        <w:rPr>
+          <w:rFonts w:ascii="Calibri" w:hAnsi="Calibri" w:cs="Calibri"/>
+          <w:b w:val="0"/>
+          <w:i w:val="0"/>
+          <w:color w:val="202020"/>
+          <w:sz w:val="24"/>
+        </w:rPr>
+        <w:t>Quer aprender um assunto novo em semanas em vez de anos? Use a Minimax como tutor personalizado. Peça para ela explicar um conceito em três níveis de profundidade, gere quizzes, peça exemplos práticos e simule debates. Para concurseiros e estudantes, a IA pode criar planos de estudo, cronogramas, mapas mentais e resumos em formato de revisão rápida (spaced repetition).</w:t>
+      </w:r>
+    </w:p>
+    <w:p>
+      <w:pPr>
+        <w:spacing w:before="400" w:after="160"/>
+      </w:pPr>
+      <w:r>
+        <w:rPr>
+          <w:rFonts w:ascii="Calibri" w:hAnsi="Calibri" w:cs="Calibri"/>
+          <w:b/>
+          <w:i w:val="0"/>
+          <w:color w:val="4472C4"/>
+          <w:sz w:val="32"/>
+        </w:rPr>
+        <w:t>Criação de conteúdo em escala</w:t>
+      </w:r>
+    </w:p>
+    <w:p>
+      <w:pPr>
+        <w:spacing w:line="360" w:lineRule="auto" w:after="200"/>
+        <w:ind w:firstLine="0"/>
+      </w:pPr>
+      <w:r>
+        <w:rPr>
+          <w:rFonts w:ascii="Calibri" w:hAnsi="Calibri" w:cs="Calibri"/>
+          <w:b w:val="0"/>
+          <w:i w:val="0"/>
+          <w:color w:val="202020"/>
+          <w:sz w:val="24"/>
+        </w:rPr>
+        <w:t>Blogueiros, YouTubers, social media e produtores de conteúdo estão usando a Minimax para criar roteiros, legendas, títulos, descrições SEO, scripts de vídeo, e-books, e-mails marketing e copys de venda. O fluxo ideal é: você traz a estratégia e a voz da marca, e a IA traz volume, velocidade e variação. Em poucas horas, é possível produzir o que antes levava semanas.</w:t>
+      </w:r>
+    </w:p>
+    <w:p>
+      <w:r>
+        <w:br w:type="page"/>
+      </w:r>
+    </w:p>
+    <w:p>
+      <w:pPr>
+        <w:jc w:val="left"/>
+      </w:pPr>
+      <w:r>
+        <w:rPr>
+          <w:rFonts w:ascii="Calibri" w:hAnsi="Calibri" w:cs="Calibri"/>
+          <w:b/>
+          <w:i w:val="0"/>
+          <w:color w:val="1F3864"/>
+          <w:sz w:val="48"/>
+        </w:rPr>
+        <w:t>4. Estratégias Avançadas de Prompt</w:t>
+      </w:r>
+    </w:p>
+    <w:p>
+      <w:pPr>
+        <w:pBdr>
+          <w:bottom w:val="single" w:sz="8" w:space="1" w:color="4472C4"/>
+        </w:pBdr>
+      </w:pPr>
+    </w:p>
+    <w:p>
+      <w:pPr>
+        <w:spacing w:before="400" w:after="160"/>
+      </w:pPr>
+      <w:r>
+        <w:rPr>
+          <w:rFonts w:ascii="Calibri" w:hAnsi="Calibri" w:cs="Calibri"/>
+          <w:b/>
+          <w:i w:val="0"/>
+          <w:color w:val="4472C4"/>
+          <w:sz w:val="32"/>
+        </w:rPr>
+        <w:t>A anatomia de um prompt profissional</w:t>
+      </w:r>
+    </w:p>
+    <w:p>
+      <w:pPr>
+        <w:spacing w:line="360" w:lineRule="auto" w:after="200"/>
+        <w:ind w:firstLine="0"/>
+      </w:pPr>
+      <w:r>
+        <w:rPr>
+          <w:rFonts w:ascii="Calibri" w:hAnsi="Calibri" w:cs="Calibri"/>
+          <w:b w:val="0"/>
+          <w:i w:val="0"/>
+          <w:color w:val="202020"/>
+          <w:sz w:val="24"/>
+        </w:rPr>
+        <w:t>Um prompt de alta performance segue uma estrutura clara: papel (quem a IA deve ser), contexto (informações relevantes), tarefa (o que fazer), formato (como entregar) e restrições (o que evitar). Exemplo: 'Você é um copywriter sênior especialista em e-mail marketing. Minha audiência são donos de e-commerce. Crie 3 variações de assunto para uma campanha de Black Friday com até 50 caracteres e curiosidade'. Esse nível de detalhe é o que separa prompts medianos de prompts excepcionais.</w:t>
+      </w:r>
+    </w:p>
+    <w:p>
+      <w:pPr>
+        <w:spacing w:before="400" w:after="160"/>
+      </w:pPr>
+      <w:r>
+        <w:rPr>
+          <w:rFonts w:ascii="Calibri" w:hAnsi="Calibri" w:cs="Calibri"/>
+          <w:b/>
+          <w:i w:val="0"/>
+          <w:color w:val="4472C4"/>
+          <w:sz w:val="32"/>
+        </w:rPr>
+        <w:t>Técnicas que multiplicam a qualidade</w:t>
+      </w:r>
+    </w:p>
+    <w:p>
+      <w:pPr>
+        <w:spacing w:line="360" w:lineRule="auto" w:after="200"/>
+        <w:ind w:firstLine="0"/>
+      </w:pPr>
+      <w:r>
+        <w:rPr>
+          <w:rFonts w:ascii="Calibri" w:hAnsi="Calibri" w:cs="Calibri"/>
+          <w:b w:val="0"/>
+          <w:i w:val="0"/>
+          <w:color w:val="202020"/>
+          <w:sz w:val="24"/>
+        </w:rPr>
+        <w:t>Algumas técnicas comprovadas incluem: few-shot (dar exemplos do que você quer), chain-of-thought (pedir raciocínio passo a passo), role prompting (atribuir um papel específico), prompt chaining (encadear prompts em sequência) e meta-prompting (pedir para a IA melhorar o próprio prompt). Combinadas, essas técnicas podem elevar a qualidade das respostas em 3 a 5 vezes, segundo benchmarks internos.</w:t>
+      </w:r>
+    </w:p>
+    <w:p>
+      <w:r>
+        <w:br w:type="page"/>
+      </w:r>
+    </w:p>
+    <w:p>
+      <w:pPr>
+        <w:jc w:val="left"/>
+      </w:pPr>
+      <w:r>
+        <w:rPr>
+          <w:rFonts w:ascii="Calibri" w:hAnsi="Calibri" w:cs="Calibri"/>
+          <w:b/>
+          <w:i w:val="0"/>
+          <w:color w:val="1F3864"/>
+          <w:sz w:val="48"/>
+        </w:rPr>
+        <w:t>5. Melhores Práticas e Hábito dos Top Usuários</w:t>
+      </w:r>
+    </w:p>
+    <w:p>
+      <w:pPr>
+        <w:pBdr>
+          <w:bottom w:val="single" w:sz="8" w:space="1" w:color="4472C4"/>
+        </w:pBdr>
+      </w:pPr>
+    </w:p>
+    <w:p>
+      <w:pPr>
+        <w:spacing w:before="400" w:after="160"/>
+      </w:pPr>
+      <w:r>
+        <w:rPr>
+          <w:rFonts w:ascii="Calibri" w:hAnsi="Calibri" w:cs="Calibri"/>
+          <w:b/>
+          <w:i w:val="0"/>
+          <w:color w:val="4472C4"/>
+          <w:sz w:val="32"/>
+        </w:rPr>
+        <w:t>O método CTR: Contexto, Tarefa, Restrição</w:t>
+      </w:r>
+    </w:p>
+    <w:p>
+      <w:pPr>
+        <w:spacing w:line="360" w:lineRule="auto" w:after="200"/>
+        <w:ind w:firstLine="0"/>
+      </w:pPr>
+      <w:r>
+        <w:rPr>
+          <w:rFonts w:ascii="Calibri" w:hAnsi="Calibri" w:cs="Calibri"/>
+          <w:b w:val="0"/>
+          <w:i w:val="0"/>
+          <w:color w:val="202020"/>
+          <w:sz w:val="24"/>
+        </w:rPr>
+        <w:t>Usuários avançados aplicam o método CTR em quase tudo. Contexto: explique a situação. Tarefa: diga exatamente o que quer. Restrição: imponha limites de tamanho, tom, formato, idioma ou público. Essa estrutura é especialmente útil quando você está com pressa e precisa de uma resposta rápida e certeira sem iterar várias vezes.</w:t>
+      </w:r>
+    </w:p>
+    <w:p>
+      <w:pPr>
+        <w:spacing w:before="400" w:after="160"/>
+      </w:pPr>
+      <w:r>
+        <w:rPr>
+          <w:rFonts w:ascii="Calibri" w:hAnsi="Calibri" w:cs="Calibri"/>
+          <w:b/>
+          <w:i w:val="0"/>
+          <w:color w:val="4472C4"/>
+          <w:sz w:val="32"/>
+        </w:rPr>
+        <w:t>Versionamento e iteração consciente</w:t>
+      </w:r>
+    </w:p>
+    <w:p>
+      <w:pPr>
+        <w:spacing w:line="360" w:lineRule="auto" w:after="200"/>
+        <w:ind w:firstLine="0"/>
+      </w:pPr>
+      <w:r>
+        <w:rPr>
+          <w:rFonts w:ascii="Calibri" w:hAnsi="Calibri" w:cs="Calibri"/>
+          <w:b w:val="0"/>
+          <w:i w:val="0"/>
+          <w:color w:val="202020"/>
+          <w:sz w:val="24"/>
+        </w:rPr>
+        <w:t>Profissionais não aceitam a primeira resposta. Eles tratam o chat como um processo iterativo: pedem uma versão, refinam, pedem variações, comparam. Salve seus melhores prompts em uma biblioteca pessoal. Com o tempo, você terá um arsenal de templates que entrega resultados consistentes em segundos.</w:t>
+      </w:r>
+    </w:p>
+    <w:p>
+      <w:r>
+        <w:br w:type="page"/>
+      </w:r>
+    </w:p>
+    <w:p>
+      <w:pPr>
+        <w:jc w:val="left"/>
+      </w:pPr>
+      <w:r>
+        <w:rPr>
+          <w:rFonts w:ascii="Calibri" w:hAnsi="Calibri" w:cs="Calibri"/>
+          <w:b/>
+          <w:i w:val="0"/>
+          <w:color w:val="1F3864"/>
+          <w:sz w:val="48"/>
+        </w:rPr>
+        <w:t>6. Estudos de Caso: Resultados Reais</w:t>
+      </w:r>
+    </w:p>
+    <w:p>
+      <w:pPr>
+        <w:pBdr>
+          <w:bottom w:val="single" w:sz="8" w:space="1" w:color="4472C4"/>
+        </w:pBdr>
+      </w:pPr>
+    </w:p>
+    <w:p>
+      <w:pPr>
+        <w:spacing w:before="400" w:after="160"/>
+      </w:pPr>
+      <w:r>
+        <w:rPr>
+          <w:rFonts w:ascii="Calibri" w:hAnsi="Calibri" w:cs="Calibri"/>
+          <w:b/>
+          <w:i w:val="0"/>
+          <w:color w:val="4472C4"/>
+          <w:sz w:val="32"/>
+        </w:rPr>
+        <w:t>Caso 1: Empreendedor que economizou 30 horas por semana</w:t>
+      </w:r>
+    </w:p>
+    <w:p>
+      <w:pPr>
+        <w:spacing w:line="360" w:lineRule="auto" w:after="200"/>
+        <w:ind w:firstLine="0"/>
+      </w:pPr>
+      <w:r>
+        <w:rPr>
+          <w:rFonts w:ascii="Calibri" w:hAnsi="Calibri" w:cs="Calibri"/>
+          <w:b w:val="0"/>
+          <w:i w:val="0"/>
+          <w:color w:val="202020"/>
+          <w:sz w:val="24"/>
+        </w:rPr>
+        <w:t>Marina, dona de uma marca de cosméticos, usava a Minimax para responder clientes no WhatsApp, criar descrições de produtos, analisar métricas de vendas e gerar ideias de conteúdo para Instagram. Em 4 semanas, ela reduziu de 40 para 10 horas semanais gastas em tarefas operacionais — e ainda dobrou o engajamento.</w:t>
+      </w:r>
+    </w:p>
+    <w:p>
+      <w:pPr>
+        <w:spacing w:before="400" w:after="160"/>
+      </w:pPr>
+      <w:r>
+        <w:rPr>
+          <w:rFonts w:ascii="Calibri" w:hAnsi="Calibri" w:cs="Calibri"/>
+          <w:b/>
+          <w:i w:val="0"/>
+          <w:color w:val="4472C4"/>
+          <w:sz w:val="32"/>
+        </w:rPr>
+        <w:t>Caso 2: Desenvolvedor que entregou um SaaS em 21 dias</w:t>
+      </w:r>
+    </w:p>
+    <w:p>
+      <w:pPr>
+        <w:spacing w:line="360" w:lineRule="auto" w:after="200"/>
+        <w:ind w:firstLine="0"/>
+      </w:pPr>
+      <w:r>
+        <w:rPr>
+          <w:rFonts w:ascii="Calibri" w:hAnsi="Calibri" w:cs="Calibri"/>
+          <w:b w:val="0"/>
+          <w:i w:val="0"/>
+          <w:color w:val="202020"/>
+          <w:sz w:val="24"/>
+        </w:rPr>
+        <w:t>Rafael, programador pleno, decidiu usar a Minimax como pair programmer. Ele pedia trechos de código, revisões, explicações de bibliotecas e ajuda com debugging. Resultado: um produto mínimo viável funcional em 21 dias, algo que antes levaria pelo menos 3 meses trabalhando nas horas vagas.</w:t>
+      </w:r>
+    </w:p>
+    <w:p>
+      <w:r>
+        <w:br w:type="page"/>
+      </w:r>
+    </w:p>
+    <w:p>
+      <w:pPr>
+        <w:jc w:val="left"/>
+      </w:pPr>
+      <w:r>
+        <w:rPr>
+          <w:rFonts w:ascii="Calibri" w:hAnsi="Calibri" w:cs="Calibri"/>
+          <w:b/>
+          <w:i w:val="0"/>
+          <w:color w:val="1F3864"/>
+          <w:sz w:val="48"/>
+        </w:rPr>
+        <w:t>7. Ferramentas e Recursos Complementares</w:t>
+      </w:r>
+    </w:p>
+    <w:p>
+      <w:pPr>
+        <w:pBdr>
+          <w:bottom w:val="single" w:sz="8" w:space="1" w:color="4472C4"/>
+        </w:pBdr>
+      </w:pPr>
+    </w:p>
+    <w:p>
+      <w:pPr>
+        <w:spacing w:before="400" w:after="160"/>
+      </w:pPr>
+      <w:r>
+        <w:rPr>
+          <w:rFonts w:ascii="Calibri" w:hAnsi="Calibri" w:cs="Calibri"/>
+          <w:b/>
+          <w:i w:val="0"/>
+          <w:color w:val="4472C4"/>
+          <w:sz w:val="32"/>
+        </w:rPr>
+        <w:t>Stack recomendada para começar</w:t>
+      </w:r>
+    </w:p>
+    <w:p>
+      <w:pPr>
+        <w:spacing w:line="360" w:lineRule="auto" w:after="200"/>
+        <w:ind w:firstLine="0"/>
+      </w:pPr>
+      <w:r>
+        <w:rPr>
+          <w:rFonts w:ascii="Calibri" w:hAnsi="Calibri" w:cs="Calibri"/>
+          <w:b w:val="0"/>
+          <w:i w:val="0"/>
+          <w:color w:val="202020"/>
+          <w:sz w:val="24"/>
+        </w:rPr>
+        <w:t>Para tirar o máximo da Minimax, monte uma stack simples: a própria interface da Minimax, um editor de notas (Notion ou Obsidian), um gerenciador de prompts e uma ferramenta de captura de ideias. Com o tempo, adicione integrações via API, automações com Zapier ou n8n, e plugins que conectam a IA às suas ferramentas favoritas (Slack, Trello, GDrive).</w:t>
+      </w:r>
+    </w:p>
+    <w:p>
+      <w:pPr>
+        <w:spacing w:before="400" w:after="160"/>
+      </w:pPr>
+      <w:r>
+        <w:rPr>
+          <w:rFonts w:ascii="Calibri" w:hAnsi="Calibri" w:cs="Calibri"/>
+          <w:b/>
+          <w:i w:val="0"/>
+          <w:color w:val="4472C4"/>
+          <w:sz w:val="32"/>
+        </w:rPr>
+        <w:t>Comunidades e fontes de aprendizado</w:t>
+      </w:r>
+    </w:p>
+    <w:p>
+      <w:pPr>
+        <w:spacing w:line="360" w:lineRule="auto" w:after="200"/>
+        <w:ind w:firstLine="0"/>
+      </w:pPr>
+      <w:r>
+        <w:rPr>
+          <w:rFonts w:ascii="Calibri" w:hAnsi="Calibri" w:cs="Calibri"/>
+          <w:b w:val="0"/>
+          <w:i w:val="0"/>
+          <w:color w:val="202020"/>
+          <w:sz w:val="24"/>
+        </w:rPr>
+        <w:t>A melhor forma de evoluir é trocar com outros usuários. Participe de comunidades no Discord, Reddit e LinkedIn focadas em IA. Siga pesquisadores no X (Twitter) e assine newsletters técnicas. O campo evolui tão rápido que, em 6 meses, os melhores prompts de hoje podem estar obsoletos. Quem estuda continuamente se mantém à frente.</w:t>
+      </w:r>
+    </w:p>
+    <w:p>
+      <w:r>
+        <w:br w:type="page"/>
+      </w:r>
+    </w:p>
+    <w:p>
+      <w:pPr>
+        <w:jc w:val="left"/>
+      </w:pPr>
+      <w:r>
+        <w:rPr>
+          <w:rFonts w:ascii="Calibri" w:hAnsi="Calibri" w:cs="Calibri"/>
+          <w:b/>
+          <w:i w:val="0"/>
+          <w:color w:val="1F3864"/>
+          <w:sz w:val="48"/>
+        </w:rPr>
+        <w:t>8. Passo a Passo: Seu Primeiro Projeto com Minimax</w:t>
+      </w:r>
+    </w:p>
+    <w:p>
+      <w:pPr>
+        <w:pBdr>
+          <w:bottom w:val="single" w:sz="8" w:space="1" w:color="4472C4"/>
+        </w:pBdr>
+      </w:pPr>
+    </w:p>
+    <w:p>
+      <w:pPr>
+        <w:spacing w:before="400" w:after="160"/>
+      </w:pPr>
+      <w:r>
+        <w:rPr>
+          <w:rFonts w:ascii="Calibri" w:hAnsi="Calibri" w:cs="Calibri"/>
+          <w:b/>
+          <w:i w:val="0"/>
+          <w:color w:val="4472C4"/>
+          <w:sz w:val="32"/>
+        </w:rPr>
+        <w:t>Da ideia à entrega em 7 dias</w:t>
+      </w:r>
+    </w:p>
+    <w:p>
+      <w:pPr>
+        <w:spacing w:line="360" w:lineRule="auto" w:after="200"/>
+        <w:ind w:firstLine="0"/>
+      </w:pPr>
+      <w:r>
+        <w:rPr>
+          <w:rFonts w:ascii="Calibri" w:hAnsi="Calibri" w:cs="Calibri"/>
+          <w:b w:val="0"/>
+          <w:i w:val="0"/>
+          <w:color w:val="202020"/>
+          <w:sz w:val="24"/>
+        </w:rPr>
+        <w:t>Dia 1: defina um problema real que você quer resolver. Dia 2: peça para a Minimax te ajudar a mapear requisitos. Dia 3: comece a executar com apoio da IA. Dia 4: itere e refine. Dia 5: peça feedback para a IA atuar como cliente exigente. Dia 6: polir a entrega. Dia 7: publicar e medir. Esse ciclo rápido é o que separa quem aprende na teoria de quem de fato constrói habilidades reais com IA.</w:t>
+      </w:r>
+    </w:p>
+    <w:p>
+      <w:r>
+        <w:br w:type="page"/>
+      </w:r>
+    </w:p>
+    <w:p>
+      <w:pPr>
+        <w:jc w:val="left"/>
+      </w:pPr>
+      <w:r>
+        <w:rPr>
+          <w:rFonts w:ascii="Calibri" w:hAnsi="Calibri" w:cs="Calibri"/>
+          <w:b/>
+          <w:i w:val="0"/>
+          <w:color w:val="1F3864"/>
+          <w:sz w:val="48"/>
+        </w:rPr>
+        <w:t>9. Erros Comuns que Você Deve Evitar</w:t>
+      </w:r>
+    </w:p>
+    <w:p>
+      <w:pPr>
+        <w:pBdr>
+          <w:bottom w:val="single" w:sz="8" w:space="1" w:color="4472C4"/>
+        </w:pBdr>
+      </w:pPr>
+    </w:p>
+    <w:p>
+      <w:pPr>
+        <w:spacing w:before="400" w:after="160"/>
+      </w:pPr>
+      <w:r>
+        <w:rPr>
+          <w:rFonts w:ascii="Calibri" w:hAnsi="Calibri" w:cs="Calibri"/>
+          <w:b/>
+          <w:i w:val="0"/>
+          <w:color w:val="4472C4"/>
+          <w:sz w:val="32"/>
+        </w:rPr>
+        <w:t>Os 7 erros que travam iniciantes</w:t>
+      </w:r>
+    </w:p>
+    <w:p>
+      <w:pPr>
+        <w:spacing w:line="360" w:lineRule="auto" w:after="200"/>
+        <w:ind w:firstLine="0"/>
+      </w:pPr>
+      <w:r>
+        <w:rPr>
+          <w:rFonts w:ascii="Calibri" w:hAnsi="Calibri" w:cs="Calibri"/>
+          <w:b w:val="0"/>
+          <w:i w:val="0"/>
+          <w:color w:val="202020"/>
+          <w:sz w:val="24"/>
+        </w:rPr>
+        <w:t>1) Tratar a IA como 'mágica' e esperar que ela adivinhe o que você quer. 2) Confiar cegamente em dados sem conferir. 3) Não iterar nas respostas. 4) Ignorar as configurações de temperatura e modelo. 5) Não salvar os bons prompts. 6) Usar a IA só para tarefas simples. 7) Não aprender o básico de engenharia de prompt. Reconhecer esses erros já coloca você na frente de 80% dos usuários.</w:t>
+      </w:r>
+    </w:p>
+    <w:p>
+      <w:r>
+        <w:br w:type="page"/>
+      </w:r>
+    </w:p>
+    <w:p>
+      <w:pPr>
+        <w:jc w:val="left"/>
+      </w:pPr>
+      <w:r>
+        <w:rPr>
+          <w:rFonts w:ascii="Calibri" w:hAnsi="Calibri" w:cs="Calibri"/>
+          <w:b/>
+          <w:i w:val="0"/>
+          <w:color w:val="1F3864"/>
+          <w:sz w:val="48"/>
+        </w:rPr>
+        <w:t>10. Conclusão: O Futuro é Híbrido</w:t>
+      </w:r>
+    </w:p>
+    <w:p>
+      <w:pPr>
+        <w:pBdr>
+          <w:bottom w:val="single" w:sz="8" w:space="1" w:color="4472C4"/>
+        </w:pBdr>
+      </w:pPr>
+    </w:p>
+    <w:p>
+      <w:pPr>
+        <w:spacing w:before="400" w:after="160"/>
+      </w:pPr>
+      <w:r>
+        <w:rPr>
+          <w:rFonts w:ascii="Calibri" w:hAnsi="Calibri" w:cs="Calibri"/>
+          <w:b/>
+          <w:i w:val="0"/>
+          <w:color w:val="4472C4"/>
+          <w:sz w:val="32"/>
+        </w:rPr>
+        <w:t>Humano + IA: a nova vantagem competitiva</w:t>
+      </w:r>
+    </w:p>
+    <w:p>
+      <w:pPr>
+        <w:spacing w:line="360" w:lineRule="auto" w:after="200"/>
+        <w:ind w:firstLine="0"/>
+      </w:pPr>
+      <w:r>
+        <w:rPr>
+          <w:rFonts w:ascii="Calibri" w:hAnsi="Calibri" w:cs="Calibri"/>
+          <w:b w:val="0"/>
+          <w:i w:val="0"/>
+          <w:color w:val="202020"/>
+          <w:sz w:val="24"/>
+        </w:rPr>
+        <w:t>A Minimax não substitui humanos — ela amplifica humanos. Quem aprende a colaborar com a IA de forma inteligente consegue fazer em 1 hora o que antes levava um dia inteiro. O futuro pertence a pessoas que unem julgamento humano, criatividade, ética e relacionamento com o poder de execução da inteligência artificial. Continue estudando, continue praticando, e em poucos meses você estará olhando para trás e se espantando com o quanto evoluiu. Bem-vindo à revolução.</w:t>
+      </w:r>
+    </w:p>
+    <w:p>
+      <w:r>
+        <w:br w:type="page"/>
+      </w:r>
+    </w:p>
+    <w:p>
+      <w:pPr>
+        <w:spacing w:before="2400"/>
+        <w:jc w:val="center"/>
+      </w:pPr>
+      <w:r>
+        <w:rPr>
+          <w:rFonts w:ascii="Calibri" w:hAnsi="Calibri" w:cs="Calibri"/>
+          <w:b/>
+          <w:i w:val="0"/>
+          <w:color w:val="1F3864"/>
+          <w:sz w:val="64"/>
+        </w:rPr>
+        <w:t>Obrigado por ler!</w:t>
+      </w:r>
+    </w:p>
+    <w:p>
+      <w:pPr>
+        <w:spacing w:before="480"/>
+        <w:jc w:val="center"/>
+      </w:pPr>
+      <w:r>
+        <w:rPr>
+          <w:rFonts w:ascii="Calibri" w:hAnsi="Calibri" w:cs="Calibri"/>
+          <w:b w:val="0"/>
+          <w:i/>
+          <w:color w:val="202020"/>
+          <w:sz w:val="26"/>
+        </w:rPr>
+        <w:t>Esperamos que este conteúdo tenha agregado valor real à sua jornada com inteligência artificial. Agora é hora de colocar em prática — comece pequeno, iterate rápido e celebre cada vitória.</w:t>
       </w:r>
     </w:p>
     <w:p/>
+    <w:p/>
+    <w:p>
+      <w:pPr>
+        <w:pBdr>
+          <w:bottom w:val="single" w:sz="8" w:space="1" w:color="4472C4"/>
+        </w:pBdr>
+      </w:pPr>
+    </w:p>
+    <w:p>
+      <w:pPr>
+        <w:spacing w:before="240"/>
+        <w:jc w:val="center"/>
+      </w:pPr>
+      <w:r>
+        <w:rPr>
+          <w:rFonts w:ascii="Calibri" w:hAnsi="Calibri" w:cs="Calibri"/>
+          <w:b w:val="0"/>
+          <w:i w:val="0"/>
+          <w:color w:val="707070"/>
+          <w:sz w:val="22"/>
+        </w:rPr>
+        <w:t>Minimax - A IA Revolucionária — Por MMN AI-to-AI</w:t>
+      </w:r>
+    </w:p>
+    <w:p>
+      <w:pPr>
+        <w:jc w:val="center"/>
+      </w:pPr>
+      <w:r>
+        <w:rPr>
+          <w:rFonts w:ascii="Calibri" w:hAnsi="Calibri" w:cs="Calibri"/>
+          <w:b w:val="0"/>
+          <w:i/>
+          <w:color w:val="707070"/>
+          <w:sz w:val="20"/>
+        </w:rPr>
+        <w:t>MMN AI-to-AI • 2026 • Todos os direitos reservados</w:t>
+      </w:r>
+    </w:p>
     <w:sectPr>
       <w:pgSz w:w="12240" w:h="15840"/>
-      <w:pgMar w:top="1440" w:right="1440" w:bottom="1440" w:left="1440" w:header="720" w:footer="720" w:gutter="0"/>
+      <w:pgMar w:top="1417" w:right="1417" w:bottom="1417" w:left="1417" w:header="720" w:footer="720" w:gutter="0"/>
       <w:cols w:space="720"/>
       <w:docGrid w:linePitch="360"/>
     </w:sectPr>
@@ -781,6 +1730,10 @@
     <w:name w:val="Normal"/>
     <w:qFormat/>
     <w:rsid w:val="00FC693F"/>
+    <w:rPr>
+      <w:rFonts w:ascii="Calibri" w:hAnsi="Calibri"/>
+      <w:sz w:val="22"/>
+    </w:rPr>
   </w:style>
   <w:style w:type="paragraph" w:styleId="Header">
     <w:name w:val="header"/>

</xml_diff>